<commit_message>
all-in-one config file working inside of source_SANDBOX. next steps, modification of host.py to automatically pull key
</commit_message>
<xml_diff>
--- a/shef_automation_1/steps.docx
+++ b/shef_automation_1/steps.docx
@@ -348,6 +348,18 @@
     <w:p>
       <w:r>
         <w:t>Ensure correct keys in code.</w:t>
+      </w:r>
+    </w:p>
+    <w:p>
+      <w:r>
+        <w:t>New bridge, header files in place with one-stop shop for parameters.</w:t>
+      </w:r>
+      <w:r>
+        <w:br/>
+      </w:r>
+      <w:r>
+        <w:tab/>
+        <w:t>include -DUSE_SHEF_FIXED_CONFIG flag to enable</w:t>
       </w:r>
     </w:p>
     <w:sectPr>

</xml_diff>